<commit_message>
add the memnto design
</commit_message>
<xml_diff>
--- a/Design patterns - final project.docx
+++ b/Design patterns - final project.docx
@@ -74,17 +74,19 @@
         <w:t>Source Control</w:t>
       </w:r>
     </w:p>
-    <w:bookmarkEnd w:id="0"/>
     <w:p>
       <w:pPr>
         <w:jc w:val="both"/>
         <w:rPr>
-          <w:rFonts w:cstheme="minorHAnsi"/>
-          <w:sz w:val="24"/>
-          <w:szCs w:val="24"/>
-          <w:rtl/>
-        </w:rPr>
-      </w:pPr>
+          <w:rFonts w:cstheme="minorHAnsi" w:hint="cs"/>
+          <w:sz w:val="24"/>
+          <w:szCs w:val="24"/>
+          <w:rtl/>
+        </w:rPr>
+      </w:pPr>
+      <w:bookmarkStart w:id="1" w:name="_GoBack"/>
+      <w:bookmarkEnd w:id="0"/>
+      <w:bookmarkEnd w:id="1"/>
     </w:p>
     <w:p>
       <w:pPr>
@@ -150,42 +152,42 @@
         <w:spacing w:line="276" w:lineRule="auto"/>
         <w:jc w:val="both"/>
         <w:rPr>
-          <w:highlight w:val="green"/>
-        </w:rPr>
-      </w:pPr>
-      <w:bookmarkStart w:id="1" w:name="_Hlk160432124"/>
-      <w:r>
-        <w:rPr>
-          <w:rFonts w:hint="cs"/>
-          <w:highlight w:val="green"/>
+          <w:highlight w:val="yellow"/>
+        </w:rPr>
+      </w:pPr>
+      <w:bookmarkStart w:id="2" w:name="_Hlk160432124"/>
+      <w:r>
+        <w:rPr>
+          <w:rFonts w:hint="cs"/>
+          <w:highlight w:val="yellow"/>
           <w:rtl/>
         </w:rPr>
         <w:t xml:space="preserve">המערכת תאפשר אכסון של </w:t>
       </w:r>
       <w:r>
         <w:rPr>
-          <w:highlight w:val="green"/>
+          <w:highlight w:val="yellow"/>
         </w:rPr>
         <w:t>branches</w:t>
       </w:r>
       <w:r>
         <w:rPr>
           <w:rFonts w:hint="cs"/>
-          <w:highlight w:val="green"/>
+          <w:highlight w:val="yellow"/>
           <w:rtl/>
         </w:rPr>
         <w:t xml:space="preserve"> שונים, כאשר כל </w:t>
       </w:r>
       <w:r>
         <w:rPr>
-          <w:highlight w:val="green"/>
+          <w:highlight w:val="yellow"/>
         </w:rPr>
         <w:t>branch</w:t>
       </w:r>
       <w:r>
         <w:rPr>
           <w:rFonts w:hint="cs"/>
-          <w:highlight w:val="green"/>
+          <w:highlight w:val="yellow"/>
           <w:rtl/>
         </w:rPr>
         <w:t xml:space="preserve"> יכול להכיל קבצים שונים או אותם קבצים עם שינויי קוד.</w:t>
@@ -236,20 +238,28 @@
         </w:numPr>
         <w:spacing w:line="276" w:lineRule="auto"/>
         <w:jc w:val="both"/>
-      </w:pPr>
-      <w:r>
-        <w:rPr>
-          <w:rFonts w:hint="cs"/>
+        <w:rPr>
+          <w:highlight w:val="yellow"/>
+        </w:rPr>
+      </w:pPr>
+      <w:r>
+        <w:rPr>
+          <w:rFonts w:hint="cs"/>
+          <w:highlight w:val="yellow"/>
           <w:rtl/>
         </w:rPr>
         <w:t>משתמש יכול לשנות / להוסיף תיקיות וקבצי קוד ל</w:t>
       </w:r>
       <w:r>
+        <w:rPr>
+          <w:highlight w:val="yellow"/>
+        </w:rPr>
         <w:t>branch</w:t>
       </w:r>
       <w:r>
         <w:rPr>
           <w:rFonts w:hint="cs"/>
+          <w:highlight w:val="yellow"/>
           <w:rtl/>
         </w:rPr>
         <w:t xml:space="preserve"> מסוים.</w:t>
@@ -474,16 +484,7 @@
           <w:rFonts w:hint="cs"/>
           <w:rtl/>
         </w:rPr>
-        <w:t>מ</w:t>
-      </w:r>
-      <w:bookmarkStart w:id="2" w:name="_GoBack"/>
-      <w:bookmarkEnd w:id="2"/>
-      <w:r>
-        <w:rPr>
-          <w:rFonts w:hint="cs"/>
-          <w:rtl/>
-        </w:rPr>
-        <w:t>משי ב</w:t>
+        <w:t>ממשי ב</w:t>
       </w:r>
       <w:r>
         <w:t>commit</w:t>
@@ -697,7 +698,7 @@
         </w:rPr>
         <w:t>בהצלחה רבה!</w:t>
       </w:r>
-      <w:bookmarkEnd w:id="1"/>
+      <w:bookmarkEnd w:id="2"/>
     </w:p>
     <w:sectPr>
       <w:headerReference w:type="default" r:id="rId8"/>
@@ -1720,7 +1721,7 @@
 </file>
 
 <file path=customXml/itemProps1.xml><?xml version="1.0" encoding="utf-8"?>
-<ds:datastoreItem xmlns:ds="http://schemas.openxmlformats.org/officeDocument/2006/customXml" ds:itemID="{EA2DDE0C-9029-466A-A04A-67F25C47BE21}">
+<ds:datastoreItem xmlns:ds="http://schemas.openxmlformats.org/officeDocument/2006/customXml" ds:itemID="{D4867209-B93B-4745-B5B7-D0A82E9C4909}">
   <ds:schemaRefs>
     <ds:schemaRef ds:uri="http://schemas.openxmlformats.org/officeDocument/2006/bibliography"/>
   </ds:schemaRefs>

</xml_diff>